<commit_message>
Launch data analysis and report
</commit_message>
<xml_diff>
--- a/reports/launch_report.docx
+++ b/reports/launch_report.docx
@@ -18,7 +18,7 @@
           <w:color w:val="8D99AE"/>
           <w:sz w:val="22"/>
         </w:rPr>
-        <w:t>Launches 2020 to 2026  |  Generated 19 September 2026</w:t>
+        <w:t>Launches 2002 to 2026  |  Generated 19 September 2026</w:t>
       </w:r>
     </w:p>
     <w:p>
@@ -34,7 +34,7 @@
         <w:pStyle w:val="ListBullet"/>
       </w:pPr>
       <w:r>
-        <w:t>1,500 completed launches between 2020 and 2026, with an overall success rate of 95.6%.</w:t>
+        <w:t>3,000 completed launches between 2002 and 2026, with an overall success rate of 94.6%.</w:t>
       </w:r>
     </w:p>
     <w:p>
@@ -50,7 +50,7 @@
         <w:pStyle w:val="ListBullet"/>
       </w:pPr>
       <w:r>
-        <w:t>Most active provider: SpaceX (42% of all launches).</w:t>
+        <w:t>Most active provider: SpaceX (24% of all launches).</w:t>
       </w:r>
     </w:p>
     <w:p>
@@ -58,7 +58,7 @@
         <w:pStyle w:val="ListBullet"/>
       </w:pPr>
       <w:r>
-        <w:t>Most launched rocket: Falcon 9 (600 launches).</w:t>
+        <w:t>Most launched rocket: Falcon 9 (689 launches).</w:t>
       </w:r>
     </w:p>
     <w:p>
@@ -66,7 +66,7 @@
         <w:pStyle w:val="ListBullet"/>
       </w:pPr>
       <w:r>
-        <w:t>Among rockets with at least 20 launches, Long March 2C has the highest success rate (100.0%) and Kuaizhou 1A the lowest (86.4%).</w:t>
+        <w:t>Among rockets with at least 20 launches, Atlas V 401 has the highest success rate (100.0%) and Rokot/Briz-KM the lowest (89.3%).</w:t>
       </w:r>
     </w:p>
     <w:p>
@@ -389,7 +389,7 @@
               <w:rPr>
                 <w:sz w:val="20"/>
               </w:rPr>
-              <w:t>600</w:t>
+              <w:t>689</w:t>
             </w:r>
           </w:p>
         </w:tc>
@@ -407,7 +407,7 @@
               <w:rPr>
                 <w:sz w:val="20"/>
               </w:rPr>
-              <w:t>599</w:t>
+              <w:t>685</w:t>
             </w:r>
           </w:p>
         </w:tc>
@@ -425,7 +425,7 @@
               <w:rPr>
                 <w:sz w:val="20"/>
               </w:rPr>
-              <w:t>99.8%</w:t>
+              <w:t>99.4%</w:t>
             </w:r>
           </w:p>
         </w:tc>
@@ -446,7 +446,7 @@
               <w:rPr>
                 <w:sz w:val="20"/>
               </w:rPr>
-              <w:t>Electron</w:t>
+              <w:t>Long March 2D</w:t>
             </w:r>
           </w:p>
         </w:tc>
@@ -465,7 +465,7 @@
               <w:rPr>
                 <w:sz w:val="20"/>
               </w:rPr>
-              <w:t>83</w:t>
+              <w:t>98</w:t>
             </w:r>
           </w:p>
         </w:tc>
@@ -484,7 +484,7 @@
               <w:rPr>
                 <w:sz w:val="20"/>
               </w:rPr>
-              <w:t>81</w:t>
+              <w:t>97</w:t>
             </w:r>
           </w:p>
         </w:tc>
@@ -503,7 +503,7 @@
               <w:rPr>
                 <w:sz w:val="20"/>
               </w:rPr>
-              <w:t>97.6%</w:t>
+              <w:t>99.0%</w:t>
             </w:r>
           </w:p>
         </w:tc>
@@ -523,7 +523,7 @@
               <w:rPr>
                 <w:sz w:val="20"/>
               </w:rPr>
-              <w:t>Long March 2D</w:t>
+              <w:t>Electron</w:t>
             </w:r>
           </w:p>
         </w:tc>
@@ -541,7 +541,7 @@
               <w:rPr>
                 <w:sz w:val="20"/>
               </w:rPr>
-              <w:t>53</w:t>
+              <w:t>96</w:t>
             </w:r>
           </w:p>
         </w:tc>
@@ -559,7 +559,7 @@
               <w:rPr>
                 <w:sz w:val="20"/>
               </w:rPr>
-              <w:t>53</w:t>
+              <w:t>92</w:t>
             </w:r>
           </w:p>
         </w:tc>
@@ -577,7 +577,7 @@
               <w:rPr>
                 <w:sz w:val="20"/>
               </w:rPr>
-              <w:t>100.0%</w:t>
+              <w:t>95.8%</w:t>
             </w:r>
           </w:p>
         </w:tc>
@@ -617,7 +617,7 @@
               <w:rPr>
                 <w:sz w:val="20"/>
               </w:rPr>
-              <w:t>44</w:t>
+              <w:t>78</w:t>
             </w:r>
           </w:p>
         </w:tc>
@@ -636,7 +636,7 @@
               <w:rPr>
                 <w:sz w:val="20"/>
               </w:rPr>
-              <w:t>43</w:t>
+              <w:t>76</w:t>
             </w:r>
           </w:p>
         </w:tc>
@@ -655,7 +655,7 @@
               <w:rPr>
                 <w:sz w:val="20"/>
               </w:rPr>
-              <w:t>97.7%</w:t>
+              <w:t>97.4%</w:t>
             </w:r>
           </w:p>
         </w:tc>
@@ -675,7 +675,7 @@
               <w:rPr>
                 <w:sz w:val="20"/>
               </w:rPr>
-              <w:t>Soyuz 2.1a</w:t>
+              <w:t>Ariane 5 ECA</w:t>
             </w:r>
           </w:p>
         </w:tc>
@@ -693,7 +693,7 @@
               <w:rPr>
                 <w:sz w:val="20"/>
               </w:rPr>
-              <w:t>37</w:t>
+              <w:t>73</w:t>
             </w:r>
           </w:p>
         </w:tc>
@@ -711,7 +711,7 @@
               <w:rPr>
                 <w:sz w:val="20"/>
               </w:rPr>
-              <w:t>37</w:t>
+              <w:t>71</w:t>
             </w:r>
           </w:p>
         </w:tc>
@@ -729,7 +729,7 @@
               <w:rPr>
                 <w:sz w:val="20"/>
               </w:rPr>
-              <w:t>100.0%</w:t>
+              <w:t>97.3%</w:t>
             </w:r>
           </w:p>
         </w:tc>
@@ -750,7 +750,7 @@
               <w:rPr>
                 <w:sz w:val="20"/>
               </w:rPr>
-              <w:t>Long March 4C</w:t>
+              <w:t>SpaceShipTwo</w:t>
             </w:r>
           </w:p>
         </w:tc>
@@ -769,7 +769,7 @@
               <w:rPr>
                 <w:sz w:val="20"/>
               </w:rPr>
-              <w:t>32</w:t>
+              <w:t>67</w:t>
             </w:r>
           </w:p>
         </w:tc>
@@ -788,7 +788,7 @@
               <w:rPr>
                 <w:sz w:val="20"/>
               </w:rPr>
-              <w:t>32</w:t>
+              <w:t>62</w:t>
             </w:r>
           </w:p>
         </w:tc>
@@ -807,7 +807,7 @@
               <w:rPr>
                 <w:sz w:val="20"/>
               </w:rPr>
-              <w:t>100.0%</w:t>
+              <w:t>92.5%</w:t>
             </w:r>
           </w:p>
         </w:tc>
@@ -827,7 +827,7 @@
               <w:rPr>
                 <w:sz w:val="20"/>
               </w:rPr>
-              <w:t>Soyuz 2.1b/Fregat-M</w:t>
+              <w:t>Proton-M Briz-M</w:t>
             </w:r>
           </w:p>
         </w:tc>
@@ -845,7 +845,7 @@
               <w:rPr>
                 <w:sz w:val="20"/>
               </w:rPr>
-              <w:t>27</w:t>
+              <w:t>67</w:t>
             </w:r>
           </w:p>
         </w:tc>
@@ -863,7 +863,7 @@
               <w:rPr>
                 <w:sz w:val="20"/>
               </w:rPr>
-              <w:t>27</w:t>
+              <w:t>61</w:t>
             </w:r>
           </w:p>
         </w:tc>
@@ -881,7 +881,311 @@
               <w:rPr>
                 <w:sz w:val="20"/>
               </w:rPr>
-              <w:t>100.0%</w:t>
+              <w:t>91.0%</w:t>
+            </w:r>
+          </w:p>
+        </w:tc>
+      </w:tr>
+      <w:tr>
+        <w:tc>
+          <w:tcPr>
+            <w:tcW w:type="dxa" w:w="3969"/>
+            <w:shd w:val="clear" w:color="auto" w:fill="F3F5F8"/>
+          </w:tcPr>
+          <w:p>
+            <w:pPr>
+              <w:spacing w:before="60" w:after="60"/>
+              <w:jc w:val="left"/>
+            </w:pPr>
+            <w:r/>
+            <w:r>
+              <w:rPr>
+                <w:sz w:val="20"/>
+              </w:rPr>
+              <w:t>Soyuz</w:t>
+            </w:r>
+          </w:p>
+        </w:tc>
+        <w:tc>
+          <w:tcPr>
+            <w:tcW w:type="dxa" w:w="1701"/>
+            <w:shd w:val="clear" w:color="auto" w:fill="F3F5F8"/>
+          </w:tcPr>
+          <w:p>
+            <w:pPr>
+              <w:spacing w:before="60" w:after="60"/>
+              <w:jc w:val="right"/>
+            </w:pPr>
+            <w:r/>
+            <w:r>
+              <w:rPr>
+                <w:sz w:val="20"/>
+              </w:rPr>
+              <w:t>61</w:t>
+            </w:r>
+          </w:p>
+        </w:tc>
+        <w:tc>
+          <w:tcPr>
+            <w:tcW w:type="dxa" w:w="1701"/>
+            <w:shd w:val="clear" w:color="auto" w:fill="F3F5F8"/>
+          </w:tcPr>
+          <w:p>
+            <w:pPr>
+              <w:spacing w:before="60" w:after="60"/>
+              <w:jc w:val="right"/>
+            </w:pPr>
+            <w:r/>
+            <w:r>
+              <w:rPr>
+                <w:sz w:val="20"/>
+              </w:rPr>
+              <w:t>60</w:t>
+            </w:r>
+          </w:p>
+        </w:tc>
+        <w:tc>
+          <w:tcPr>
+            <w:tcW w:type="dxa" w:w="1701"/>
+            <w:shd w:val="clear" w:color="auto" w:fill="F3F5F8"/>
+          </w:tcPr>
+          <w:p>
+            <w:pPr>
+              <w:spacing w:before="60" w:after="60"/>
+              <w:jc w:val="right"/>
+            </w:pPr>
+            <w:r/>
+            <w:r>
+              <w:rPr>
+                <w:sz w:val="20"/>
+              </w:rPr>
+              <w:t>98.4%</w:t>
+            </w:r>
+          </w:p>
+        </w:tc>
+      </w:tr>
+      <w:tr>
+        <w:tc>
+          <w:tcPr>
+            <w:tcW w:type="dxa" w:w="3969"/>
+          </w:tcPr>
+          <w:p>
+            <w:pPr>
+              <w:spacing w:before="60" w:after="60"/>
+              <w:jc w:val="left"/>
+            </w:pPr>
+            <w:r/>
+            <w:r>
+              <w:rPr>
+                <w:sz w:val="20"/>
+              </w:rPr>
+              <w:t>Long March 4C</w:t>
+            </w:r>
+          </w:p>
+        </w:tc>
+        <w:tc>
+          <w:tcPr>
+            <w:tcW w:type="dxa" w:w="1701"/>
+          </w:tcPr>
+          <w:p>
+            <w:pPr>
+              <w:spacing w:before="60" w:after="60"/>
+              <w:jc w:val="right"/>
+            </w:pPr>
+            <w:r/>
+            <w:r>
+              <w:rPr>
+                <w:sz w:val="20"/>
+              </w:rPr>
+              <w:t>60</w:t>
+            </w:r>
+          </w:p>
+        </w:tc>
+        <w:tc>
+          <w:tcPr>
+            <w:tcW w:type="dxa" w:w="1701"/>
+          </w:tcPr>
+          <w:p>
+            <w:pPr>
+              <w:spacing w:before="60" w:after="60"/>
+              <w:jc w:val="right"/>
+            </w:pPr>
+            <w:r/>
+            <w:r>
+              <w:rPr>
+                <w:sz w:val="20"/>
+              </w:rPr>
+              <w:t>58</w:t>
+            </w:r>
+          </w:p>
+        </w:tc>
+        <w:tc>
+          <w:tcPr>
+            <w:tcW w:type="dxa" w:w="1701"/>
+          </w:tcPr>
+          <w:p>
+            <w:pPr>
+              <w:spacing w:before="60" w:after="60"/>
+              <w:jc w:val="right"/>
+            </w:pPr>
+            <w:r/>
+            <w:r>
+              <w:rPr>
+                <w:sz w:val="20"/>
+              </w:rPr>
+              <w:t>96.7%</w:t>
+            </w:r>
+          </w:p>
+        </w:tc>
+      </w:tr>
+      <w:tr>
+        <w:tc>
+          <w:tcPr>
+            <w:tcW w:type="dxa" w:w="3969"/>
+            <w:shd w:val="clear" w:color="auto" w:fill="F3F5F8"/>
+          </w:tcPr>
+          <w:p>
+            <w:pPr>
+              <w:spacing w:before="60" w:after="60"/>
+              <w:jc w:val="left"/>
+            </w:pPr>
+            <w:r/>
+            <w:r>
+              <w:rPr>
+                <w:sz w:val="20"/>
+              </w:rPr>
+              <w:t>Soyuz 2.1a</w:t>
+            </w:r>
+          </w:p>
+        </w:tc>
+        <w:tc>
+          <w:tcPr>
+            <w:tcW w:type="dxa" w:w="1701"/>
+            <w:shd w:val="clear" w:color="auto" w:fill="F3F5F8"/>
+          </w:tcPr>
+          <w:p>
+            <w:pPr>
+              <w:spacing w:before="60" w:after="60"/>
+              <w:jc w:val="right"/>
+            </w:pPr>
+            <w:r/>
+            <w:r>
+              <w:rPr>
+                <w:sz w:val="20"/>
+              </w:rPr>
+              <w:t>58</w:t>
+            </w:r>
+          </w:p>
+        </w:tc>
+        <w:tc>
+          <w:tcPr>
+            <w:tcW w:type="dxa" w:w="1701"/>
+            <w:shd w:val="clear" w:color="auto" w:fill="F3F5F8"/>
+          </w:tcPr>
+          <w:p>
+            <w:pPr>
+              <w:spacing w:before="60" w:after="60"/>
+              <w:jc w:val="right"/>
+            </w:pPr>
+            <w:r/>
+            <w:r>
+              <w:rPr>
+                <w:sz w:val="20"/>
+              </w:rPr>
+              <w:t>57</w:t>
+            </w:r>
+          </w:p>
+        </w:tc>
+        <w:tc>
+          <w:tcPr>
+            <w:tcW w:type="dxa" w:w="1701"/>
+            <w:shd w:val="clear" w:color="auto" w:fill="F3F5F8"/>
+          </w:tcPr>
+          <w:p>
+            <w:pPr>
+              <w:spacing w:before="60" w:after="60"/>
+              <w:jc w:val="right"/>
+            </w:pPr>
+            <w:r/>
+            <w:r>
+              <w:rPr>
+                <w:sz w:val="20"/>
+              </w:rPr>
+              <w:t>98.3%</w:t>
+            </w:r>
+          </w:p>
+        </w:tc>
+      </w:tr>
+      <w:tr>
+        <w:tc>
+          <w:tcPr>
+            <w:tcW w:type="dxa" w:w="3969"/>
+          </w:tcPr>
+          <w:p>
+            <w:pPr>
+              <w:spacing w:before="60" w:after="60"/>
+              <w:jc w:val="left"/>
+            </w:pPr>
+            <w:r/>
+            <w:r>
+              <w:rPr>
+                <w:sz w:val="20"/>
+              </w:rPr>
+              <w:t>Soyuz U</w:t>
+            </w:r>
+          </w:p>
+        </w:tc>
+        <w:tc>
+          <w:tcPr>
+            <w:tcW w:type="dxa" w:w="1701"/>
+          </w:tcPr>
+          <w:p>
+            <w:pPr>
+              <w:spacing w:before="60" w:after="60"/>
+              <w:jc w:val="right"/>
+            </w:pPr>
+            <w:r/>
+            <w:r>
+              <w:rPr>
+                <w:sz w:val="20"/>
+              </w:rPr>
+              <w:t>58</w:t>
+            </w:r>
+          </w:p>
+        </w:tc>
+        <w:tc>
+          <w:tcPr>
+            <w:tcW w:type="dxa" w:w="1701"/>
+          </w:tcPr>
+          <w:p>
+            <w:pPr>
+              <w:spacing w:before="60" w:after="60"/>
+              <w:jc w:val="right"/>
+            </w:pPr>
+            <w:r/>
+            <w:r>
+              <w:rPr>
+                <w:sz w:val="20"/>
+              </w:rPr>
+              <w:t>56</w:t>
+            </w:r>
+          </w:p>
+        </w:tc>
+        <w:tc>
+          <w:tcPr>
+            <w:tcW w:type="dxa" w:w="1701"/>
+          </w:tcPr>
+          <w:p>
+            <w:pPr>
+              <w:spacing w:before="60" w:after="60"/>
+              <w:jc w:val="right"/>
+            </w:pPr>
+            <w:r/>
+            <w:r>
+              <w:rPr>
+                <w:sz w:val="20"/>
+              </w:rPr>
+              <w:t>96.6%</w:t>
             </w:r>
           </w:p>
         </w:tc>
@@ -921,7 +1225,7 @@
               <w:rPr>
                 <w:sz w:val="20"/>
               </w:rPr>
-              <w:t>26</w:t>
+              <w:t>55</w:t>
             </w:r>
           </w:p>
         </w:tc>
@@ -940,7 +1244,159 @@
               <w:rPr>
                 <w:sz w:val="20"/>
               </w:rPr>
-              <w:t>26</w:t>
+              <w:t>54</w:t>
+            </w:r>
+          </w:p>
+        </w:tc>
+        <w:tc>
+          <w:tcPr>
+            <w:tcW w:type="dxa" w:w="1701"/>
+            <w:shd w:val="clear" w:color="auto" w:fill="F3F5F8"/>
+          </w:tcPr>
+          <w:p>
+            <w:pPr>
+              <w:spacing w:before="60" w:after="60"/>
+              <w:jc w:val="right"/>
+            </w:pPr>
+            <w:r/>
+            <w:r>
+              <w:rPr>
+                <w:sz w:val="20"/>
+              </w:rPr>
+              <w:t>98.2%</w:t>
+            </w:r>
+          </w:p>
+        </w:tc>
+      </w:tr>
+      <w:tr>
+        <w:tc>
+          <w:tcPr>
+            <w:tcW w:type="dxa" w:w="3969"/>
+          </w:tcPr>
+          <w:p>
+            <w:pPr>
+              <w:spacing w:before="60" w:after="60"/>
+              <w:jc w:val="left"/>
+            </w:pPr>
+            <w:r/>
+            <w:r>
+              <w:rPr>
+                <w:sz w:val="20"/>
+              </w:rPr>
+              <w:t>Long March 4B</w:t>
+            </w:r>
+          </w:p>
+        </w:tc>
+        <w:tc>
+          <w:tcPr>
+            <w:tcW w:type="dxa" w:w="1701"/>
+          </w:tcPr>
+          <w:p>
+            <w:pPr>
+              <w:spacing w:before="60" w:after="60"/>
+              <w:jc w:val="right"/>
+            </w:pPr>
+            <w:r/>
+            <w:r>
+              <w:rPr>
+                <w:sz w:val="20"/>
+              </w:rPr>
+              <w:t>54</w:t>
+            </w:r>
+          </w:p>
+        </w:tc>
+        <w:tc>
+          <w:tcPr>
+            <w:tcW w:type="dxa" w:w="1701"/>
+          </w:tcPr>
+          <w:p>
+            <w:pPr>
+              <w:spacing w:before="60" w:after="60"/>
+              <w:jc w:val="right"/>
+            </w:pPr>
+            <w:r/>
+            <w:r>
+              <w:rPr>
+                <w:sz w:val="20"/>
+              </w:rPr>
+              <w:t>53</w:t>
+            </w:r>
+          </w:p>
+        </w:tc>
+        <w:tc>
+          <w:tcPr>
+            <w:tcW w:type="dxa" w:w="1701"/>
+          </w:tcPr>
+          <w:p>
+            <w:pPr>
+              <w:spacing w:before="60" w:after="60"/>
+              <w:jc w:val="right"/>
+            </w:pPr>
+            <w:r/>
+            <w:r>
+              <w:rPr>
+                <w:sz w:val="20"/>
+              </w:rPr>
+              <w:t>98.1%</w:t>
+            </w:r>
+          </w:p>
+        </w:tc>
+      </w:tr>
+      <w:tr>
+        <w:tc>
+          <w:tcPr>
+            <w:tcW w:type="dxa" w:w="3969"/>
+            <w:shd w:val="clear" w:color="auto" w:fill="F3F5F8"/>
+          </w:tcPr>
+          <w:p>
+            <w:pPr>
+              <w:spacing w:before="60" w:after="60"/>
+              <w:jc w:val="left"/>
+            </w:pPr>
+            <w:r/>
+            <w:r>
+              <w:rPr>
+                <w:sz w:val="20"/>
+              </w:rPr>
+              <w:t>Delta II</w:t>
+            </w:r>
+          </w:p>
+        </w:tc>
+        <w:tc>
+          <w:tcPr>
+            <w:tcW w:type="dxa" w:w="1701"/>
+            <w:shd w:val="clear" w:color="auto" w:fill="F3F5F8"/>
+          </w:tcPr>
+          <w:p>
+            <w:pPr>
+              <w:spacing w:before="60" w:after="60"/>
+              <w:jc w:val="right"/>
+            </w:pPr>
+            <w:r/>
+            <w:r>
+              <w:rPr>
+                <w:sz w:val="20"/>
+              </w:rPr>
+              <w:t>52</w:t>
+            </w:r>
+          </w:p>
+        </w:tc>
+        <w:tc>
+          <w:tcPr>
+            <w:tcW w:type="dxa" w:w="1701"/>
+            <w:shd w:val="clear" w:color="auto" w:fill="F3F5F8"/>
+          </w:tcPr>
+          <w:p>
+            <w:pPr>
+              <w:spacing w:before="60" w:after="60"/>
+              <w:jc w:val="right"/>
+            </w:pPr>
+            <w:r/>
+            <w:r>
+              <w:rPr>
+                <w:sz w:val="20"/>
+              </w:rPr>
+              <w:t>52</w:t>
             </w:r>
           </w:p>
         </w:tc>
@@ -979,7 +1435,7 @@
               <w:rPr>
                 <w:sz w:val="20"/>
               </w:rPr>
-              <w:t>Long March 6A</w:t>
+              <w:t>Proton-M</w:t>
             </w:r>
           </w:p>
         </w:tc>
@@ -997,7 +1453,7 @@
               <w:rPr>
                 <w:sz w:val="20"/>
               </w:rPr>
-              <w:t>26</w:t>
+              <w:t>48</w:t>
             </w:r>
           </w:p>
         </w:tc>
@@ -1015,7 +1471,7 @@
               <w:rPr>
                 <w:sz w:val="20"/>
               </w:rPr>
-              <w:t>26</w:t>
+              <w:t>43</w:t>
             </w:r>
           </w:p>
         </w:tc>
@@ -1033,237 +1489,7 @@
               <w:rPr>
                 <w:sz w:val="20"/>
               </w:rPr>
-              <w:t>100.0%</w:t>
-            </w:r>
-          </w:p>
-        </w:tc>
-      </w:tr>
-      <w:tr>
-        <w:tc>
-          <w:tcPr>
-            <w:tcW w:type="dxa" w:w="3969"/>
-            <w:shd w:val="clear" w:color="auto" w:fill="F3F5F8"/>
-          </w:tcPr>
-          <w:p>
-            <w:pPr>
-              <w:spacing w:before="60" w:after="60"/>
-              <w:jc w:val="left"/>
-            </w:pPr>
-            <w:r/>
-            <w:r>
-              <w:rPr>
-                <w:sz w:val="20"/>
-              </w:rPr>
-              <w:t>New Shepard</w:t>
-            </w:r>
-          </w:p>
-        </w:tc>
-        <w:tc>
-          <w:tcPr>
-            <w:tcW w:type="dxa" w:w="1701"/>
-            <w:shd w:val="clear" w:color="auto" w:fill="F3F5F8"/>
-          </w:tcPr>
-          <w:p>
-            <w:pPr>
-              <w:spacing w:before="60" w:after="60"/>
-              <w:jc w:val="right"/>
-            </w:pPr>
-            <w:r/>
-            <w:r>
-              <w:rPr>
-                <w:sz w:val="20"/>
-              </w:rPr>
-              <w:t>26</w:t>
-            </w:r>
-          </w:p>
-        </w:tc>
-        <w:tc>
-          <w:tcPr>
-            <w:tcW w:type="dxa" w:w="1701"/>
-            <w:shd w:val="clear" w:color="auto" w:fill="F3F5F8"/>
-          </w:tcPr>
-          <w:p>
-            <w:pPr>
-              <w:spacing w:before="60" w:after="60"/>
-              <w:jc w:val="right"/>
-            </w:pPr>
-            <w:r/>
-            <w:r>
-              <w:rPr>
-                <w:sz w:val="20"/>
-              </w:rPr>
-              <w:t>25</w:t>
-            </w:r>
-          </w:p>
-        </w:tc>
-        <w:tc>
-          <w:tcPr>
-            <w:tcW w:type="dxa" w:w="1701"/>
-            <w:shd w:val="clear" w:color="auto" w:fill="F3F5F8"/>
-          </w:tcPr>
-          <w:p>
-            <w:pPr>
-              <w:spacing w:before="60" w:after="60"/>
-              <w:jc w:val="right"/>
-            </w:pPr>
-            <w:r/>
-            <w:r>
-              <w:rPr>
-                <w:sz w:val="20"/>
-              </w:rPr>
-              <w:t>96.2%</w:t>
-            </w:r>
-          </w:p>
-        </w:tc>
-      </w:tr>
-      <w:tr>
-        <w:tc>
-          <w:tcPr>
-            <w:tcW w:type="dxa" w:w="3969"/>
-          </w:tcPr>
-          <w:p>
-            <w:pPr>
-              <w:spacing w:before="60" w:after="60"/>
-              <w:jc w:val="left"/>
-            </w:pPr>
-            <w:r/>
-            <w:r>
-              <w:rPr>
-                <w:sz w:val="20"/>
-              </w:rPr>
-              <w:t>Kuaizhou 1A</w:t>
-            </w:r>
-          </w:p>
-        </w:tc>
-        <w:tc>
-          <w:tcPr>
-            <w:tcW w:type="dxa" w:w="1701"/>
-          </w:tcPr>
-          <w:p>
-            <w:pPr>
-              <w:spacing w:before="60" w:after="60"/>
-              <w:jc w:val="right"/>
-            </w:pPr>
-            <w:r/>
-            <w:r>
-              <w:rPr>
-                <w:sz w:val="20"/>
-              </w:rPr>
-              <w:t>22</w:t>
-            </w:r>
-          </w:p>
-        </w:tc>
-        <w:tc>
-          <w:tcPr>
-            <w:tcW w:type="dxa" w:w="1701"/>
-          </w:tcPr>
-          <w:p>
-            <w:pPr>
-              <w:spacing w:before="60" w:after="60"/>
-              <w:jc w:val="right"/>
-            </w:pPr>
-            <w:r/>
-            <w:r>
-              <w:rPr>
-                <w:sz w:val="20"/>
-              </w:rPr>
-              <w:t>19</w:t>
-            </w:r>
-          </w:p>
-        </w:tc>
-        <w:tc>
-          <w:tcPr>
-            <w:tcW w:type="dxa" w:w="1701"/>
-          </w:tcPr>
-          <w:p>
-            <w:pPr>
-              <w:spacing w:before="60" w:after="60"/>
-              <w:jc w:val="right"/>
-            </w:pPr>
-            <w:r/>
-            <w:r>
-              <w:rPr>
-                <w:sz w:val="20"/>
-              </w:rPr>
-              <w:t>86.4%</w:t>
-            </w:r>
-          </w:p>
-        </w:tc>
-      </w:tr>
-      <w:tr>
-        <w:tc>
-          <w:tcPr>
-            <w:tcW w:type="dxa" w:w="3969"/>
-            <w:shd w:val="clear" w:color="auto" w:fill="F3F5F8"/>
-          </w:tcPr>
-          <w:p>
-            <w:pPr>
-              <w:spacing w:before="60" w:after="60"/>
-              <w:jc w:val="left"/>
-            </w:pPr>
-            <w:r/>
-            <w:r>
-              <w:rPr>
-                <w:sz w:val="20"/>
-              </w:rPr>
-              <w:t>Long March 4B</w:t>
-            </w:r>
-          </w:p>
-        </w:tc>
-        <w:tc>
-          <w:tcPr>
-            <w:tcW w:type="dxa" w:w="1701"/>
-            <w:shd w:val="clear" w:color="auto" w:fill="F3F5F8"/>
-          </w:tcPr>
-          <w:p>
-            <w:pPr>
-              <w:spacing w:before="60" w:after="60"/>
-              <w:jc w:val="right"/>
-            </w:pPr>
-            <w:r/>
-            <w:r>
-              <w:rPr>
-                <w:sz w:val="20"/>
-              </w:rPr>
-              <w:t>22</w:t>
-            </w:r>
-          </w:p>
-        </w:tc>
-        <w:tc>
-          <w:tcPr>
-            <w:tcW w:type="dxa" w:w="1701"/>
-            <w:shd w:val="clear" w:color="auto" w:fill="F3F5F8"/>
-          </w:tcPr>
-          <w:p>
-            <w:pPr>
-              <w:spacing w:before="60" w:after="60"/>
-              <w:jc w:val="right"/>
-            </w:pPr>
-            <w:r/>
-            <w:r>
-              <w:rPr>
-                <w:sz w:val="20"/>
-              </w:rPr>
-              <w:t>22</w:t>
-            </w:r>
-          </w:p>
-        </w:tc>
-        <w:tc>
-          <w:tcPr>
-            <w:tcW w:type="dxa" w:w="1701"/>
-            <w:shd w:val="clear" w:color="auto" w:fill="F3F5F8"/>
-          </w:tcPr>
-          <w:p>
-            <w:pPr>
-              <w:spacing w:before="60" w:after="60"/>
-              <w:jc w:val="right"/>
-            </w:pPr>
-            <w:r/>
-            <w:r>
-              <w:rPr>
-                <w:sz w:val="20"/>
-              </w:rPr>
-              <w:t>100.0%</w:t>
+              <w:t>89.6%</w:t>
             </w:r>
           </w:p>
         </w:tc>

</xml_diff>